<commit_message>
individual video + design spec
</commit_message>
<xml_diff>
--- a/40487649/40487649_Design_Spec.docx
+++ b/40487649/40487649_Design_Spec.docx
@@ -88,11 +88,9 @@
       <w:r>
         <w:t xml:space="preserve">This system facilitates further education for adults who wish to further their learning and gain new skills. This system would support the educational institution by </w:t>
       </w:r>
-      <w:proofErr w:type="spellStart"/>
-      <w:r>
-        <w:t>simplifing</w:t>
-      </w:r>
-      <w:proofErr w:type="spellEnd"/>
+      <w:r>
+        <w:t>simplifying</w:t>
+      </w:r>
       <w:r>
         <w:t xml:space="preserve"> management of classes and teachers</w:t>
       </w:r>
@@ -134,7 +132,42 @@
           <w:sz w:val="24"/>
           <w:szCs w:val="24"/>
         </w:rPr>
-        <w:t xml:space="preserve">Our solution aligns with SDG 4, </w:t>
+        <w:t>Our solution aligns with</w:t>
+      </w:r>
+      <w:r>
+        <w:rPr>
+          <w:sz w:val="24"/>
+          <w:szCs w:val="24"/>
+        </w:rPr>
+        <w:t xml:space="preserve"> the United Nations Sustainable Development Goal 4. Generally, Goal 4 aims to ‘</w:t>
+      </w:r>
+      <w:r>
+        <w:rPr>
+          <w:sz w:val="24"/>
+          <w:szCs w:val="24"/>
+        </w:rPr>
+        <w:t>ensure inclusive</w:t>
+      </w:r>
+      <w:r>
+        <w:rPr>
+          <w:sz w:val="24"/>
+          <w:szCs w:val="24"/>
+        </w:rPr>
+        <w:t xml:space="preserve"> and equitable quality education and promote lifelong learning opportunities for al</w:t>
+      </w:r>
+      <w:r>
+        <w:rPr>
+          <w:sz w:val="24"/>
+          <w:szCs w:val="24"/>
+        </w:rPr>
+        <w:t xml:space="preserve">l’. Our </w:t>
+      </w:r>
+      <w:r>
+        <w:rPr>
+          <w:sz w:val="24"/>
+          <w:szCs w:val="24"/>
+        </w:rPr>
+        <w:t>system would allow users to easily manage their timetables improving the ease of access of education.</w:t>
       </w:r>
     </w:p>
     <w:p>
@@ -159,12 +192,24 @@
     <w:p>
       <w:pPr>
         <w:rPr>
-          <w:b/>
-          <w:bCs/>
-          <w:sz w:val="24"/>
-          <w:szCs w:val="24"/>
-        </w:rPr>
-      </w:pPr>
+          <w:sz w:val="24"/>
+          <w:szCs w:val="24"/>
+        </w:rPr>
+      </w:pPr>
+      <w:r>
+        <w:rPr>
+          <w:sz w:val="24"/>
+          <w:szCs w:val="24"/>
+        </w:rPr>
+        <w:t xml:space="preserve">Our system would manage class schedules, staff assignments as well as class locations for an educational institution. </w:t>
+      </w:r>
+      <w:r>
+        <w:rPr>
+          <w:sz w:val="24"/>
+          <w:szCs w:val="24"/>
+        </w:rPr>
+        <w:t>Basic functionalities include creating classes, allocating locations for the classes, viewing class timetables for a member and allocating teachers.</w:t>
+      </w:r>
     </w:p>
     <w:p>
       <w:pPr>
@@ -188,12 +233,38 @@
     <w:p>
       <w:pPr>
         <w:rPr>
-          <w:b/>
-          <w:bCs/>
-          <w:sz w:val="24"/>
-          <w:szCs w:val="24"/>
-        </w:rPr>
-      </w:pPr>
+          <w:sz w:val="24"/>
+          <w:szCs w:val="24"/>
+        </w:rPr>
+      </w:pPr>
+      <w:r>
+        <w:rPr>
+          <w:sz w:val="24"/>
+          <w:szCs w:val="24"/>
+        </w:rPr>
+        <w:t>Queen’s University</w:t>
+      </w:r>
+      <w:r>
+        <w:rPr>
+          <w:sz w:val="24"/>
+          <w:szCs w:val="24"/>
+        </w:rPr>
+        <w:t xml:space="preserve"> Belfast is a large university with roughly 25,000 students. As such we decided what better system to model our solution after. </w:t>
+      </w:r>
+      <w:r>
+        <w:rPr>
+          <w:sz w:val="24"/>
+          <w:szCs w:val="24"/>
+        </w:rPr>
+        <w:t>Due to Queen’s not publishing its internal data our system will use fabricated data as test data.</w:t>
+      </w:r>
+      <w:r>
+        <w:rPr>
+          <w:sz w:val="24"/>
+          <w:szCs w:val="24"/>
+        </w:rPr>
+        <w:t xml:space="preserve"> Queen’s system contains many common elements with our proposed systems i.e. students, lecturers</w:t>
+      </w:r>
     </w:p>
     <w:p>
       <w:pPr>
@@ -223,23 +294,81 @@
           <w:szCs w:val="24"/>
         </w:rPr>
       </w:pPr>
-    </w:p>
-    <w:p>
-      <w:pPr>
-        <w:rPr>
-          <w:b/>
-          <w:bCs/>
-          <w:sz w:val="24"/>
-          <w:szCs w:val="24"/>
-        </w:rPr>
-      </w:pPr>
-      <w:r>
-        <w:rPr>
-          <w:b/>
-          <w:bCs/>
-          <w:sz w:val="24"/>
-          <w:szCs w:val="24"/>
-        </w:rPr>
+      <w:r>
+        <w:rPr>
+          <w:b/>
+          <w:bCs/>
+          <w:noProof/>
+          <w:sz w:val="24"/>
+          <w:szCs w:val="24"/>
+        </w:rPr>
+        <w:drawing>
+          <wp:inline distT="0" distB="0" distL="0" distR="0" wp14:anchorId="02080384" wp14:editId="42FAE161">
+            <wp:extent cx="3381576" cy="2667000"/>
+            <wp:effectExtent l="0" t="0" r="9525" b="0"/>
+            <wp:docPr id="105890797" name="Picture 1"/>
+            <wp:cNvGraphicFramePr>
+              <a:graphicFrameLocks xmlns:a="http://schemas.openxmlformats.org/drawingml/2006/main" noChangeAspect="1"/>
+            </wp:cNvGraphicFramePr>
+            <a:graphic xmlns:a="http://schemas.openxmlformats.org/drawingml/2006/main">
+              <a:graphicData uri="http://schemas.openxmlformats.org/drawingml/2006/picture">
+                <pic:pic xmlns:pic="http://schemas.openxmlformats.org/drawingml/2006/picture">
+                  <pic:nvPicPr>
+                    <pic:cNvPr id="0" name="Picture 1"/>
+                    <pic:cNvPicPr>
+                      <a:picLocks noChangeAspect="1" noChangeArrowheads="1"/>
+                    </pic:cNvPicPr>
+                  </pic:nvPicPr>
+                  <pic:blipFill>
+                    <a:blip r:embed="rId4" cstate="print">
+                      <a:extLst>
+                        <a:ext uri="{28A0092B-C50C-407E-A947-70E740481C1C}">
+                          <a14:useLocalDpi xmlns:a14="http://schemas.microsoft.com/office/drawing/2010/main" val="0"/>
+                        </a:ext>
+                      </a:extLst>
+                    </a:blip>
+                    <a:srcRect/>
+                    <a:stretch>
+                      <a:fillRect/>
+                    </a:stretch>
+                  </pic:blipFill>
+                  <pic:spPr bwMode="auto">
+                    <a:xfrm>
+                      <a:off x="0" y="0"/>
+                      <a:ext cx="3386821" cy="2671137"/>
+                    </a:xfrm>
+                    <a:prstGeom prst="rect">
+                      <a:avLst/>
+                    </a:prstGeom>
+                    <a:noFill/>
+                    <a:ln>
+                      <a:noFill/>
+                    </a:ln>
+                  </pic:spPr>
+                </pic:pic>
+              </a:graphicData>
+            </a:graphic>
+          </wp:inline>
+        </w:drawing>
+      </w:r>
+    </w:p>
+    <w:p>
+      <w:pPr>
+        <w:rPr>
+          <w:b/>
+          <w:bCs/>
+          <w:sz w:val="24"/>
+          <w:szCs w:val="24"/>
+        </w:rPr>
+      </w:pPr>
+      <w:r>
+        <w:rPr>
+          <w:b/>
+          <w:bCs/>
+          <w:sz w:val="24"/>
+          <w:szCs w:val="24"/>
+        </w:rPr>
+        <w:lastRenderedPageBreak/>
         <w:t>Key CRUD Functionality</w:t>
       </w:r>
       <w:r>
@@ -255,12 +384,60 @@
     <w:p>
       <w:pPr>
         <w:rPr>
-          <w:b/>
-          <w:bCs/>
-          <w:sz w:val="24"/>
-          <w:szCs w:val="24"/>
-        </w:rPr>
-      </w:pPr>
+          <w:sz w:val="24"/>
+          <w:szCs w:val="24"/>
+        </w:rPr>
+      </w:pPr>
+      <w:r>
+        <w:rPr>
+          <w:sz w:val="24"/>
+          <w:szCs w:val="24"/>
+        </w:rPr>
+        <w:t>Only tables established in the specification may be used as entities in the database:</w:t>
+      </w:r>
+    </w:p>
+    <w:p>
+      <w:pPr>
+        <w:rPr>
+          <w:sz w:val="24"/>
+          <w:szCs w:val="24"/>
+        </w:rPr>
+      </w:pPr>
+      <w:r>
+        <w:rPr>
+          <w:sz w:val="24"/>
+          <w:szCs w:val="24"/>
+        </w:rPr>
+        <w:t xml:space="preserve">Records may be created via the web interface for additional classes, </w:t>
+      </w:r>
+      <w:r>
+        <w:rPr>
+          <w:sz w:val="24"/>
+          <w:szCs w:val="24"/>
+        </w:rPr>
+        <w:t>lecturers</w:t>
+      </w:r>
+      <w:r>
+        <w:rPr>
+          <w:sz w:val="24"/>
+          <w:szCs w:val="24"/>
+        </w:rPr>
+        <w:t xml:space="preserve">, and </w:t>
+      </w:r>
+      <w:r>
+        <w:rPr>
+          <w:sz w:val="24"/>
+          <w:szCs w:val="24"/>
+        </w:rPr>
+        <w:t>class assignments</w:t>
+      </w:r>
+      <w:r>
+        <w:rPr>
+          <w:sz w:val="24"/>
+          <w:szCs w:val="24"/>
+        </w:rPr>
+        <w:t>.</w:t>
+      </w:r>
     </w:p>
     <w:p>
       <w:pPr>
@@ -280,6 +457,106 @@
         </w:rPr>
         <w:t>Data Integrity and Security Considerations</w:t>
       </w:r>
+    </w:p>
+    <w:p>
+      <w:pPr>
+        <w:rPr>
+          <w:sz w:val="24"/>
+          <w:szCs w:val="24"/>
+        </w:rPr>
+      </w:pPr>
+      <w:r>
+        <w:rPr>
+          <w:sz w:val="24"/>
+          <w:szCs w:val="24"/>
+        </w:rPr>
+        <w:t xml:space="preserve">Each student and </w:t>
+      </w:r>
+      <w:r>
+        <w:rPr>
+          <w:sz w:val="24"/>
+          <w:szCs w:val="24"/>
+        </w:rPr>
+        <w:t>lecturer</w:t>
+      </w:r>
+      <w:r>
+        <w:rPr>
+          <w:sz w:val="24"/>
+          <w:szCs w:val="24"/>
+        </w:rPr>
+        <w:t xml:space="preserve"> </w:t>
+      </w:r>
+      <w:r>
+        <w:rPr>
+          <w:sz w:val="24"/>
+          <w:szCs w:val="24"/>
+        </w:rPr>
+        <w:t xml:space="preserve">must be assigned a unique id </w:t>
+      </w:r>
+      <w:r>
+        <w:rPr>
+          <w:sz w:val="24"/>
+          <w:szCs w:val="24"/>
+        </w:rPr>
+        <w:t xml:space="preserve">to identify it. The forename and surname of each student and teacher is required. The assigned email address </w:t>
+      </w:r>
+      <w:r>
+        <w:rPr>
+          <w:sz w:val="24"/>
+          <w:szCs w:val="24"/>
+        </w:rPr>
+        <w:t xml:space="preserve">for staff </w:t>
+      </w:r>
+      <w:r>
+        <w:rPr>
+          <w:sz w:val="24"/>
+          <w:szCs w:val="24"/>
+        </w:rPr>
+        <w:t>is required.</w:t>
+      </w:r>
+      <w:r>
+        <w:rPr>
+          <w:sz w:val="24"/>
+          <w:szCs w:val="24"/>
+        </w:rPr>
+        <w:t xml:space="preserve"> </w:t>
+      </w:r>
+      <w:r>
+        <w:rPr>
+          <w:sz w:val="24"/>
+          <w:szCs w:val="24"/>
+        </w:rPr>
+        <w:t>L</w:t>
+      </w:r>
+      <w:r>
+        <w:rPr>
+          <w:sz w:val="24"/>
+          <w:szCs w:val="24"/>
+        </w:rPr>
+        <w:t>ecturers</w:t>
+      </w:r>
+      <w:r>
+        <w:rPr>
+          <w:sz w:val="24"/>
+          <w:szCs w:val="24"/>
+        </w:rPr>
+        <w:t xml:space="preserve"> </w:t>
+      </w:r>
+      <w:r>
+        <w:rPr>
+          <w:sz w:val="24"/>
+          <w:szCs w:val="24"/>
+        </w:rPr>
+        <w:t xml:space="preserve">may be assigned to multiple classes. A class may only be assigned one location. Classes require a subject, an id, a location and a teacher ID. </w:t>
+      </w:r>
+    </w:p>
+    <w:p>
+      <w:pPr>
+        <w:rPr>
+          <w:sz w:val="24"/>
+          <w:szCs w:val="24"/>
+        </w:rPr>
+      </w:pPr>
     </w:p>
     <w:sectPr>
       <w:pgSz w:w="11906" w:h="16838"/>
@@ -894,6 +1171,7 @@
   <w:style w:type="character" w:default="1" w:styleId="DefaultParagraphFont">
     <w:name w:val="Default Paragraph Font"/>
     <w:uiPriority w:val="1"/>
+    <w:semiHidden/>
     <w:unhideWhenUsed/>
   </w:style>
   <w:style w:type="table" w:default="1" w:styleId="TableNormal">

</xml_diff>